<commit_message>
change initials in docx
</commit_message>
<xml_diff>
--- a/lab2/Отчет_ЛР2.docx
+++ b/lab2/Отчет_ЛР2.docx
@@ -19,46 +19,13 @@
         <w:spacing w:before="120"/>
       </w:pPr>
       <w:r>
-        <w:rPr>
-          <w:highlight w:val="yellow"/>
-        </w:rPr>
-        <w:t>[Полное наименование образовательного учреждения]</w:t>
+        <w:t>Кафедра «ИРИТ-РтФ»</w:t>
       </w:r>
     </w:p>
     <w:p>
       <w:pPr>
         <w:pStyle w:val="TitlePage"/>
-        <w:spacing w:before="120"/>
-      </w:pPr>
-      <w:r>
-        <w:rPr>
-          <w:highlight w:val="yellow"/>
-        </w:rPr>
-        <w:t>[Институт / факультет]</w:t>
-      </w:r>
-    </w:p>
-    <w:p>
-      <w:pPr>
-        <w:pStyle w:val="TitlePage"/>
-        <w:spacing w:before="120"/>
-      </w:pPr>
-      <w:r>
-        <w:t>Кафедра «</w:t>
-      </w:r>
-      <w:r>
-        <w:rPr>
-          <w:highlight w:val="yellow"/>
-        </w:rPr>
-        <w:t>[наименование кафедры]</w:t>
-      </w:r>
-      <w:r>
-        <w:t>»</w:t>
-      </w:r>
-    </w:p>
-    <w:p>
-      <w:pPr>
-        <w:pStyle w:val="TitlePage"/>
-        <w:spacing w:before="2600"/>
+        <w:spacing w:before="3400"/>
       </w:pPr>
       <w:r>
         <w:rPr>
@@ -135,53 +102,10 @@
     <w:p>
       <w:pPr>
         <w:pStyle w:val="TitlePage"/>
-        <w:spacing w:before="280"/>
-        <w:ind w:left="5386"/>
-        <w:jc w:val="left"/>
-      </w:pPr>
-      <w:r>
-        <w:t>Проверил:</w:t>
-      </w:r>
-    </w:p>
-    <w:p>
-      <w:pPr>
-        <w:pStyle w:val="TitlePage"/>
-        <w:ind w:left="5386"/>
-        <w:jc w:val="left"/>
-      </w:pPr>
-      <w:r>
-        <w:rPr>
-          <w:highlight w:val="yellow"/>
-        </w:rPr>
-        <w:t>[должность]</w:t>
-      </w:r>
-    </w:p>
-    <w:p>
-      <w:pPr>
-        <w:pStyle w:val="TitlePage"/>
-        <w:ind w:left="5386"/>
-        <w:jc w:val="left"/>
-      </w:pPr>
-      <w:r>
-        <w:rPr>
-          <w:highlight w:val="yellow"/>
-        </w:rPr>
-        <w:t>[Фамилия И. О.]</w:t>
-      </w:r>
-    </w:p>
-    <w:p>
-      <w:pPr>
-        <w:pStyle w:val="TitlePage"/>
-        <w:spacing w:before="2400"/>
-      </w:pPr>
-      <w:r>
-        <w:rPr>
-          <w:highlight w:val="yellow"/>
-        </w:rPr>
-        <w:t>[Город]</w:t>
-      </w:r>
-      <w:r>
-        <w:t xml:space="preserve"> 2026</w:t>
+        <w:spacing w:before="3700"/>
+      </w:pPr>
+      <w:r>
+        <w:t>Екатеринбург 2026</w:t>
       </w:r>
     </w:p>
     <w:p>

</xml_diff>